<commit_message>
feat: press note says who makes Programistok and promises the recordings
A paragraph after the history: a not-for-profit conference made by the
community, not an event agency, where ticket income and partner support
go into the event. A new section promises the talk recordings on the
YouTube channel some time after the conference, as after past editions.

The note's PDF is now generated from the JSON by headless Chrome in the
press-kit script, so it cannot drift from the text again; the static
file in src/assets stays as the fallback. Press kit rebuilt.

Co-Authored-By: Claude Fable 5.1 <noreply@anthropic.com>
</commit_message>
<xml_diff>
--- a/public/press/nota-prasowa/programistok-2026-nota-prasowa.docx
+++ b/public/press/nota-prasowa/programistok-2026-nota-prasowa.docx
@@ -53,6 +53,19 @@
           <w:sz w:val="22"/>
           <w:szCs w:val="22"/>
         </w:rPr>
+        <w:t xml:space="preserve">Programistok jest konferencją not-for-profit, organizowaną przez społeczność i dla społeczności. Tworzą go ludzie z podlaskiego środowiska IT, którzy na co dzień pracują w branży, a nie firma eventowa. Wydarzenie nie jest nastawione na zysk: wpływy z biletów i wsparcie partnerów idą na organizację konferencji, a ewentualna nadwyżka wraca do kolejnej edycji. Program układają praktycy, a prelegenci przyjeżdżają przede wszystkim po to, żeby dzielić się wiedzą. To także dlatego wiedza z konferencji nie zostaje wyłącznie na sali.</w:t>
+      </w:r>
+    </w:p>
+    <w:p>
+      <w:pPr>
+        <w:spacing w:after="160" w:line="276" w:lineRule="auto"/>
+      </w:pPr>
+      <w:r>
+        <w:rPr>
+          <w:rFonts w:ascii="Calibri" w:hAnsi="Calibri"/>
+          <w:sz w:val="22"/>
+          <w:szCs w:val="22"/>
+        </w:rPr>
         <w:t xml:space="preserve">W tym roku organizatorzy rozszerzają tę formułę poza samo IT. Nowa ścieżka Biznes ma odpowiadać na problemy firm związane między innymi z cyfryzacją, automatyzacją, budowaniem produktów i wdrażaniem sztucznej inteligencji.</w:t>
       </w:r>
     </w:p>
@@ -387,6 +400,47 @@
           <w:szCs w:val="22"/>
         </w:rPr>
         <w:t xml:space="preserve">Patronat Honorowy nad konferencją objęła Jej Magnificencja Rektor Politechniki Białostockiej dr hab. inż. Marta Kosior-Kazberuk, prof. PB.</w:t>
+      </w:r>
+    </w:p>
+    <w:p>
+      <w:pPr>
+        <w:spacing w:after="200" w:line="276" w:lineRule="auto"/>
+      </w:pPr>
+      <w:r>
+        <w:rPr>
+          <w:rFonts w:ascii="Calibri" w:hAnsi="Calibri"/>
+          <w:sz w:val="30"/>
+          <w:szCs w:val="30"/>
+          <w:b/>
+        </w:rPr>
+        <w:t xml:space="preserve">Nagrania dla tych, którzy nie dotrą do Białegostoku</w:t>
+      </w:r>
+    </w:p>
+    <w:p>
+      <w:pPr>
+        <w:spacing w:after="160" w:line="276" w:lineRule="auto"/>
+      </w:pPr>
+      <w:r>
+        <w:rPr>
+          <w:rFonts w:ascii="Calibri" w:hAnsi="Calibri"/>
+          <w:sz w:val="22"/>
+          <w:szCs w:val="22"/>
+        </w:rPr>
+        <w:t xml:space="preserve">Programistok od lat oddaje społeczności nagrania wystąpień. Tak będzie i w tym roku: jakiś czas po konferencji nagrania prezentacji trafią bezpłatnie na kanał Programistoku na YouTube, tak jak po poprzednich edycjach. Z wiedzy prelegentów skorzystają dzięki temu również osoby, które nie mogą być na miejscu w Białymstoku.</w:t>
+      </w:r>
+    </w:p>
+    <w:p>
+      <w:pPr>
+        <w:spacing w:after="160" w:line="276" w:lineRule="auto"/>
+      </w:pPr>
+      <w:r>
+        <w:rPr>
+          <w:rFonts w:ascii="Calibri" w:hAnsi="Calibri"/>
+          <w:sz w:val="22"/>
+          <w:szCs w:val="22"/>
+          <w:b/>
+        </w:rPr>
+        <w:t xml:space="preserve">Kanał Programistoku na YouTube: https://www.youtube.com/@programistok</w:t>
       </w:r>
     </w:p>
     <w:p>

</xml_diff>